<commit_message>
District & Beat Conflict
Investigated discrepencies between district and beat relationships within the dataset (incorrectly labeled beats and / or districts exist).
Added a custom column to flag where conflicts are present between district and beat labelling.
Filtered Geospatial page to exclude data where conflicts exist.
Updated filters and visual interactions for better user experience.
</commit_message>
<xml_diff>
--- a/Power BI/Chicago Crimes/Documentation/Dashboard Plan.docx
+++ b/Power BI/Chicago Crimes/Documentation/Dashboard Plan.docx
@@ -1,6 +1,6 @@
 
 <file path=word/document.xml><?xml version="1.0" encoding="utf-8"?>
-<w:document xmlns:wpc="http://schemas.microsoft.com/office/word/2010/wordprocessingCanvas" xmlns:cx="http://schemas.microsoft.com/office/drawing/2014/chartex" xmlns:cx1="http://schemas.microsoft.com/office/drawing/2015/9/8/chartex" xmlns:cx2="http://schemas.microsoft.com/office/drawing/2015/10/21/chartex" xmlns:cx3="http://schemas.microsoft.com/office/drawing/2016/5/9/chartex" xmlns:cx4="http://schemas.microsoft.com/office/drawing/2016/5/10/chartex" xmlns:cx5="http://schemas.microsoft.com/office/drawing/2016/5/11/chartex" xmlns:cx6="http://schemas.microsoft.com/office/drawing/2016/5/12/chartex" xmlns:cx7="http://schemas.microsoft.com/office/drawing/2016/5/13/chartex" xmlns:cx8="http://schemas.microsoft.com/office/drawing/2016/5/14/chartex" xmlns:mc="http://schemas.openxmlformats.org/markup-compatibility/2006" xmlns:aink="http://schemas.microsoft.com/office/drawing/2016/ink" xmlns:am3d="http://schemas.microsoft.com/office/drawing/2017/model3d" xmlns:o="urn:schemas-microsoft-com:office:office" xmlns:oel="http://schemas.microsoft.com/office/2019/extlst" xmlns:r="http://schemas.openxmlformats.org/officeDocument/2006/relationships" xmlns:m="http://schemas.openxmlformats.org/officeDocument/2006/math" xmlns:v="urn:schemas-microsoft-com:vml" xmlns:wp14="http://schemas.microsoft.com/office/word/2010/wordprocessingDrawing" xmlns:wp="http://schemas.openxmlformats.org/drawingml/2006/wordprocessingDrawing" xmlns:w10="urn:schemas-microsoft-com:office:word" xmlns:w="http://schemas.openxmlformats.org/wordprocessingml/2006/main" xmlns:w14="http://schemas.microsoft.com/office/word/2010/wordml" xmlns:w15="http://schemas.microsoft.com/office/word/2012/wordml" xmlns:w16cex="http://schemas.microsoft.com/office/word/2018/wordml/cex" xmlns:w16cid="http://schemas.microsoft.com/office/word/2016/wordml/cid" xmlns:w16="http://schemas.microsoft.com/office/word/2018/wordml" xmlns:w16du="http://schemas.microsoft.com/office/word/2023/wordml/word16du" xmlns:w16sdtdh="http://schemas.microsoft.com/office/word/2020/wordml/sdtdatahash" xmlns:w16sdtfl="http://schemas.microsoft.com/office/word/2024/wordml/sdtformatlock" xmlns:w16se="http://schemas.microsoft.com/office/word/2015/wordml/symex" xmlns:wpg="http://schemas.microsoft.com/office/word/2010/wordprocessingGroup" xmlns:wpi="http://schemas.microsoft.com/office/word/2010/wordprocessingInk" xmlns:wne="http://schemas.microsoft.com/office/word/2006/wordml" xmlns:wps="http://schemas.microsoft.com/office/word/2010/wordprocessingShape" mc:Ignorable="w14 w15 w16se w16cid w16 w16cex w16sdtdh w16sdtfl w16du wp14">
+<w:document xmlns:wpc="http://schemas.microsoft.com/office/word/2010/wordprocessingCanvas" xmlns:cx="http://schemas.microsoft.com/office/drawing/2014/chartex" xmlns:cx1="http://schemas.microsoft.com/office/drawing/2015/9/8/chartex" xmlns:cx2="http://schemas.microsoft.com/office/drawing/2015/10/21/chartex" xmlns:cx3="http://schemas.microsoft.com/office/drawing/2016/5/9/chartex" xmlns:cx4="http://schemas.microsoft.com/office/drawing/2016/5/10/chartex" xmlns:cx5="http://schemas.microsoft.com/office/drawing/2016/5/11/chartex" xmlns:cx6="http://schemas.microsoft.com/office/drawing/2016/5/12/chartex" xmlns:cx7="http://schemas.microsoft.com/office/drawing/2016/5/13/chartex" xmlns:cx8="http://schemas.microsoft.com/office/drawing/2016/5/14/chartex" xmlns:mc="http://schemas.openxmlformats.org/markup-compatibility/2006" xmlns:aink="http://schemas.microsoft.com/office/drawing/2016/ink" xmlns:am3d="http://schemas.microsoft.com/office/drawing/2017/model3d" xmlns:o="urn:schemas-microsoft-com:office:office" xmlns:oel="http://schemas.microsoft.com/office/2019/extlst" xmlns:r="http://schemas.openxmlformats.org/officeDocument/2006/relationships" xmlns:m="http://schemas.openxmlformats.org/officeDocument/2006/math" xmlns:v="urn:schemas-microsoft-com:vml" xmlns:wp14="http://schemas.microsoft.com/office/word/2010/wordprocessingDrawing" xmlns:wp="http://schemas.openxmlformats.org/drawingml/2006/wordprocessingDrawing" xmlns:w10="urn:schemas-microsoft-com:office:word" xmlns:w="http://schemas.openxmlformats.org/wordprocessingml/2006/main" xmlns:w14="http://schemas.microsoft.com/office/word/2010/wordml" xmlns:w15="http://schemas.microsoft.com/office/word/2012/wordml" xmlns:w16cei="http://schemas.microsoft.com/office/word/2026/wordml/cei" xmlns:w16cex="http://schemas.microsoft.com/office/word/2018/wordml/cex" xmlns:w16cid="http://schemas.microsoft.com/office/word/2016/wordml/cid" xmlns:w16="http://schemas.microsoft.com/office/word/2018/wordml" xmlns:w16du="http://schemas.microsoft.com/office/word/2023/wordml/word16du" xmlns:w16sdtdh="http://schemas.microsoft.com/office/word/2020/wordml/sdtdatahash" xmlns:w16sdtfl="http://schemas.microsoft.com/office/word/2024/wordml/sdtformatlock" xmlns:w16se="http://schemas.microsoft.com/office/word/2015/wordml/symex" xmlns:wpg="http://schemas.microsoft.com/office/word/2010/wordprocessingGroup" xmlns:wpi="http://schemas.microsoft.com/office/word/2010/wordprocessingInk" xmlns:wne="http://schemas.microsoft.com/office/word/2006/wordml" xmlns:wps="http://schemas.microsoft.com/office/word/2010/wordprocessingShape" mc:Ignorable="w14 w15 w16se w16cid w16 w16cex w16sdtdh w16sdtfl w16du wp14">
   <w:body>
     <w:p>
       <w:pPr>
@@ -498,7 +498,23 @@
           <w:sz w:val="21"/>
           <w:szCs w:val="21"/>
         </w:rPr>
-        <w:t>Crime Hotspots by Beat (TopN table)</w:t>
+        <w:t>Crime Hotspots by Beat (</w:t>
+      </w:r>
+      <w:proofErr w:type="spellStart"/>
+      <w:r>
+        <w:rPr>
+          <w:sz w:val="21"/>
+          <w:szCs w:val="21"/>
+        </w:rPr>
+        <w:t>TopN</w:t>
+      </w:r>
+      <w:proofErr w:type="spellEnd"/>
+      <w:r>
+        <w:rPr>
+          <w:sz w:val="21"/>
+          <w:szCs w:val="21"/>
+        </w:rPr>
+        <w:t xml:space="preserve"> table)</w:t>
       </w:r>
     </w:p>
     <w:p>
@@ -2033,9 +2049,42 @@
           <w:sz w:val="21"/>
           <w:szCs w:val="21"/>
         </w:rPr>
-        <w:t xml:space="preserve">Shape Map using TopoJSON files derived from Chicago Data Portal GeoJSONs, then converted using </w:t>
+        <w:t xml:space="preserve">Shape Map using </w:t>
+      </w:r>
+      <w:proofErr w:type="spellStart"/>
+      <w:r>
+        <w:rPr>
+          <w:sz w:val="21"/>
+          <w:szCs w:val="21"/>
+        </w:rPr>
+        <w:t>TopoJSON</w:t>
+      </w:r>
+      <w:proofErr w:type="spellEnd"/>
+      <w:r>
+        <w:rPr>
+          <w:sz w:val="21"/>
+          <w:szCs w:val="21"/>
+        </w:rPr>
+        <w:t xml:space="preserve"> files derived from Chicago Data Portal </w:t>
+      </w:r>
+      <w:proofErr w:type="spellStart"/>
+      <w:r>
+        <w:rPr>
+          <w:sz w:val="21"/>
+          <w:szCs w:val="21"/>
+        </w:rPr>
+        <w:t>GeoJSONs</w:t>
+      </w:r>
+      <w:proofErr w:type="spellEnd"/>
+      <w:r>
+        <w:rPr>
+          <w:sz w:val="21"/>
+          <w:szCs w:val="21"/>
+        </w:rPr>
+        <w:t xml:space="preserve">, then converted using </w:t>
       </w:r>
       <w:hyperlink r:id="rId6" w:history="1">
+        <w:proofErr w:type="spellStart"/>
         <w:r>
           <w:rPr>
             <w:rStyle w:val="Hyperlink"/>
@@ -2044,6 +2093,7 @@
           </w:rPr>
           <w:t>Mapshaper</w:t>
         </w:r>
+        <w:proofErr w:type="spellEnd"/>
       </w:hyperlink>
       <w:r>
         <w:rPr>
@@ -2378,6 +2428,161 @@
           <w:szCs w:val="21"/>
         </w:rPr>
         <w:t>Crime Shifts bar chart displaying which regional locations have shown the greatest growth or decline in crimes compared against the previous year. Possesses drilldown hierarchy for beats per district, showing a breakdown of how each beat contributes to the growth or acceleration of crimes within the district it belongs to (for targeted actionability addressing root causes). Filtered by top and bottom 5 ranked by crime totals to avoid off-screen data concealed by scrollbars.</w:t>
+      </w:r>
+    </w:p>
+    <w:p>
+      <w:pPr>
+        <w:pStyle w:val="ListParagraph"/>
+        <w:numPr>
+          <w:ilvl w:val="1"/>
+          <w:numId w:val="2"/>
+        </w:numPr>
+        <w:rPr>
+          <w:sz w:val="21"/>
+          <w:szCs w:val="21"/>
+        </w:rPr>
+      </w:pPr>
+      <w:r>
+        <w:rPr>
+          <w:sz w:val="21"/>
+          <w:szCs w:val="21"/>
+        </w:rPr>
+        <w:t>Optimisations</w:t>
+      </w:r>
+    </w:p>
+    <w:p>
+      <w:pPr>
+        <w:pStyle w:val="ListParagraph"/>
+        <w:numPr>
+          <w:ilvl w:val="2"/>
+          <w:numId w:val="2"/>
+        </w:numPr>
+        <w:rPr>
+          <w:sz w:val="21"/>
+          <w:szCs w:val="21"/>
+        </w:rPr>
+      </w:pPr>
+      <w:r>
+        <w:rPr>
+          <w:sz w:val="21"/>
+          <w:szCs w:val="21"/>
+        </w:rPr>
+        <w:t xml:space="preserve">When drilled down into beats using the Crime Shift chart, many beats outside of the expected district were highlighted. When investigated, it was determined that there were mismatched beat and district pairs, where the beat is expected to contain the district number as part of the first one or two digits in the integer. These mismatches could be </w:t>
+      </w:r>
+      <w:r>
+        <w:rPr>
+          <w:sz w:val="21"/>
+          <w:szCs w:val="21"/>
+        </w:rPr>
+        <w:lastRenderedPageBreak/>
+        <w:t xml:space="preserve">caused by typos, or legacy systems, but regardless it is difficult to determine which mismatched pairs are caused by an incorrect beat, or the typo. Rather than making assumptions and causing irreversible changes to the data which harms the integrity, were flagged and retained. This allows for potentially insightful data to be retained, whilst providing context to where issues are present within the data. This was done by creating a custom rule-based column in Power Query to extract and compare whether the district and beat pairs match. </w:t>
+      </w:r>
+      <w:r>
+        <w:rPr>
+          <w:sz w:val="21"/>
+          <w:szCs w:val="21"/>
+        </w:rPr>
+        <w:br/>
+        <w:t>E.g.  ‘</w:t>
+      </w:r>
+      <w:proofErr w:type="spellStart"/>
+      <w:r>
+        <w:rPr>
+          <w:i/>
+          <w:iCs/>
+          <w:sz w:val="21"/>
+          <w:szCs w:val="21"/>
+        </w:rPr>
+        <w:t>district_beat_conflict</w:t>
+      </w:r>
+      <w:proofErr w:type="spellEnd"/>
+      <w:r>
+        <w:rPr>
+          <w:sz w:val="21"/>
+          <w:szCs w:val="21"/>
+        </w:rPr>
+        <w:t>’ column.</w:t>
+      </w:r>
+      <w:r>
+        <w:rPr>
+          <w:sz w:val="21"/>
+          <w:szCs w:val="21"/>
+        </w:rPr>
+        <w:br/>
+      </w:r>
+      <w:r>
+        <w:rPr>
+          <w:b/>
+          <w:bCs/>
+          <w:sz w:val="21"/>
+          <w:szCs w:val="21"/>
+        </w:rPr>
+        <w:t>Beat 1213 = District 12 is False</w:t>
+      </w:r>
+      <w:r>
+        <w:rPr>
+          <w:sz w:val="21"/>
+          <w:szCs w:val="21"/>
+        </w:rPr>
+        <w:t>, because the first two digits correspond to the correct district pairing.</w:t>
+      </w:r>
+      <w:r>
+        <w:rPr>
+          <w:sz w:val="21"/>
+          <w:szCs w:val="21"/>
+        </w:rPr>
+        <w:br/>
+      </w:r>
+      <w:r>
+        <w:rPr>
+          <w:b/>
+          <w:bCs/>
+          <w:sz w:val="21"/>
+          <w:szCs w:val="21"/>
+        </w:rPr>
+        <w:t>Beat 1213 = District 7 is True</w:t>
+      </w:r>
+      <w:r>
+        <w:rPr>
+          <w:sz w:val="21"/>
+          <w:szCs w:val="21"/>
+        </w:rPr>
+        <w:t>, because there is a conflict between the district value in the beat where 12 != 7.</w:t>
+      </w:r>
+      <w:r>
+        <w:rPr>
+          <w:sz w:val="21"/>
+          <w:szCs w:val="21"/>
+        </w:rPr>
+        <w:br/>
+        <w:t>This column in then used in the Geospatial page as a filter to exclude data that is geographically unreliable.</w:t>
+      </w:r>
+      <w:r>
+        <w:rPr>
+          <w:sz w:val="21"/>
+          <w:szCs w:val="21"/>
+        </w:rPr>
+        <w:t xml:space="preserve"> </w:t>
+      </w:r>
+    </w:p>
+    <w:p>
+      <w:pPr>
+        <w:pStyle w:val="ListParagraph"/>
+        <w:numPr>
+          <w:ilvl w:val="2"/>
+          <w:numId w:val="2"/>
+        </w:numPr>
+        <w:rPr>
+          <w:sz w:val="21"/>
+          <w:szCs w:val="21"/>
+        </w:rPr>
+      </w:pPr>
+      <w:r>
+        <w:rPr>
+          <w:sz w:val="21"/>
+          <w:szCs w:val="21"/>
+        </w:rPr>
+        <w:t xml:space="preserve">Filtered the map to exclude beats or districts that are blank. This removes 0 or blank values as the minimum value for the heatmap, which may have lead to a light shaded regions of the map where crimes were not actually present. </w:t>
       </w:r>
     </w:p>
     <w:sectPr>
@@ -2391,7 +2596,7 @@
 </file>
 
 <file path=word/numbering.xml><?xml version="1.0" encoding="utf-8"?>
-<w:numbering xmlns:wpc="http://schemas.microsoft.com/office/word/2010/wordprocessingCanvas" xmlns:cx="http://schemas.microsoft.com/office/drawing/2014/chartex" xmlns:cx1="http://schemas.microsoft.com/office/drawing/2015/9/8/chartex" xmlns:cx2="http://schemas.microsoft.com/office/drawing/2015/10/21/chartex" xmlns:cx3="http://schemas.microsoft.com/office/drawing/2016/5/9/chartex" xmlns:cx4="http://schemas.microsoft.com/office/drawing/2016/5/10/chartex" xmlns:cx5="http://schemas.microsoft.com/office/drawing/2016/5/11/chartex" xmlns:cx6="http://schemas.microsoft.com/office/drawing/2016/5/12/chartex" xmlns:cx7="http://schemas.microsoft.com/office/drawing/2016/5/13/chartex" xmlns:cx8="http://schemas.microsoft.com/office/drawing/2016/5/14/chartex" xmlns:mc="http://schemas.openxmlformats.org/markup-compatibility/2006" xmlns:aink="http://schemas.microsoft.com/office/drawing/2016/ink" xmlns:am3d="http://schemas.microsoft.com/office/drawing/2017/model3d" xmlns:o="urn:schemas-microsoft-com:office:office" xmlns:oel="http://schemas.microsoft.com/office/2019/extlst" xmlns:r="http://schemas.openxmlformats.org/officeDocument/2006/relationships" xmlns:m="http://schemas.openxmlformats.org/officeDocument/2006/math" xmlns:v="urn:schemas-microsoft-com:vml" xmlns:wp14="http://schemas.microsoft.com/office/word/2010/wordprocessingDrawing" xmlns:wp="http://schemas.openxmlformats.org/drawingml/2006/wordprocessingDrawing" xmlns:w10="urn:schemas-microsoft-com:office:word" xmlns:w="http://schemas.openxmlformats.org/wordprocessingml/2006/main" xmlns:w14="http://schemas.microsoft.com/office/word/2010/wordml" xmlns:w15="http://schemas.microsoft.com/office/word/2012/wordml" xmlns:w16cex="http://schemas.microsoft.com/office/word/2018/wordml/cex" xmlns:w16cid="http://schemas.microsoft.com/office/word/2016/wordml/cid" xmlns:w16="http://schemas.microsoft.com/office/word/2018/wordml" xmlns:w16du="http://schemas.microsoft.com/office/word/2023/wordml/word16du" xmlns:w16sdtdh="http://schemas.microsoft.com/office/word/2020/wordml/sdtdatahash" xmlns:w16sdtfl="http://schemas.microsoft.com/office/word/2024/wordml/sdtformatlock" xmlns:w16se="http://schemas.microsoft.com/office/word/2015/wordml/symex" xmlns:wpg="http://schemas.microsoft.com/office/word/2010/wordprocessingGroup" xmlns:wpi="http://schemas.microsoft.com/office/word/2010/wordprocessingInk" xmlns:wne="http://schemas.microsoft.com/office/word/2006/wordml" xmlns:wps="http://schemas.microsoft.com/office/word/2010/wordprocessingShape" mc:Ignorable="w14 w15 w16se w16cid w16 w16cex w16sdtdh w16sdtfl w16du wp14">
+<w:numbering xmlns:wpc="http://schemas.microsoft.com/office/word/2010/wordprocessingCanvas" xmlns:cx="http://schemas.microsoft.com/office/drawing/2014/chartex" xmlns:cx1="http://schemas.microsoft.com/office/drawing/2015/9/8/chartex" xmlns:cx2="http://schemas.microsoft.com/office/drawing/2015/10/21/chartex" xmlns:cx3="http://schemas.microsoft.com/office/drawing/2016/5/9/chartex" xmlns:cx4="http://schemas.microsoft.com/office/drawing/2016/5/10/chartex" xmlns:cx5="http://schemas.microsoft.com/office/drawing/2016/5/11/chartex" xmlns:cx6="http://schemas.microsoft.com/office/drawing/2016/5/12/chartex" xmlns:cx7="http://schemas.microsoft.com/office/drawing/2016/5/13/chartex" xmlns:cx8="http://schemas.microsoft.com/office/drawing/2016/5/14/chartex" xmlns:mc="http://schemas.openxmlformats.org/markup-compatibility/2006" xmlns:aink="http://schemas.microsoft.com/office/drawing/2016/ink" xmlns:am3d="http://schemas.microsoft.com/office/drawing/2017/model3d" xmlns:o="urn:schemas-microsoft-com:office:office" xmlns:oel="http://schemas.microsoft.com/office/2019/extlst" xmlns:r="http://schemas.openxmlformats.org/officeDocument/2006/relationships" xmlns:m="http://schemas.openxmlformats.org/officeDocument/2006/math" xmlns:v="urn:schemas-microsoft-com:vml" xmlns:wp14="http://schemas.microsoft.com/office/word/2010/wordprocessingDrawing" xmlns:wp="http://schemas.openxmlformats.org/drawingml/2006/wordprocessingDrawing" xmlns:w10="urn:schemas-microsoft-com:office:word" xmlns:w="http://schemas.openxmlformats.org/wordprocessingml/2006/main" xmlns:w14="http://schemas.microsoft.com/office/word/2010/wordml" xmlns:w15="http://schemas.microsoft.com/office/word/2012/wordml" xmlns:w16cei="http://schemas.microsoft.com/office/word/2026/wordml/cei" xmlns:w16cex="http://schemas.microsoft.com/office/word/2018/wordml/cex" xmlns:w16cid="http://schemas.microsoft.com/office/word/2016/wordml/cid" xmlns:w16="http://schemas.microsoft.com/office/word/2018/wordml" xmlns:w16du="http://schemas.microsoft.com/office/word/2023/wordml/word16du" xmlns:w16sdtdh="http://schemas.microsoft.com/office/word/2020/wordml/sdtdatahash" xmlns:w16sdtfl="http://schemas.microsoft.com/office/word/2024/wordml/sdtformatlock" xmlns:w16se="http://schemas.microsoft.com/office/word/2015/wordml/symex" xmlns:wpg="http://schemas.microsoft.com/office/word/2010/wordprocessingGroup" xmlns:wpi="http://schemas.microsoft.com/office/word/2010/wordprocessingInk" xmlns:wne="http://schemas.microsoft.com/office/word/2006/wordml" xmlns:wps="http://schemas.microsoft.com/office/word/2010/wordprocessingShape" mc:Ignorable="w14 w15 w16se w16cid w16 w16cex w16sdtdh w16sdtfl w16du wp14">
   <w:abstractNum w:abstractNumId="0" w15:restartNumberingAfterBreak="0">
     <w:nsid w:val="38E5798E"/>
     <w:multiLevelType w:val="hybridMultilevel"/>

</xml_diff>